<commit_message>
AI Security Vulnerability Assessment and fix.
</commit_message>
<xml_diff>
--- a/docs/Software docs/RFQ System Product Overview - HE.docx
+++ b/docs/Software docs/RFQ System Product Overview - HE.docx
@@ -174,7 +174,7 @@
         </w:numPr>
         <w:bidi/>
         <w:rPr>
-          <w:rFonts w:cs="Times New Roman" w:hint="cs"/>
+          <w:rFonts w:cs="Times New Roman"/>
           <w:rtl/>
           <w:lang w:bidi="he-IL"/>
         </w:rPr>
@@ -183,6 +183,9 @@
     <w:sdt>
       <w:sdtPr>
         <w:rPr>
+          <w:rFonts w:ascii="Liberation Serif" w:eastAsia="AR PL SungtiL GB" w:hAnsi="Liberation Serif" w:cs="Noto Sans Devanagari"/>
+          <w:spacing w:val="0"/>
+          <w:kern w:val="0"/>
           <w:sz w:val="44"/>
           <w:szCs w:val="44"/>
           <w:rtl/>
@@ -195,12 +198,9 @@
       </w:sdtPr>
       <w:sdtEndPr>
         <w:rPr>
-          <w:rFonts w:ascii="Liberation Serif" w:eastAsia="AR PL SungtiL GB" w:hAnsi="Liberation Serif" w:cs="Noto Sans Devanagari"/>
           <w:b/>
           <w:bCs/>
           <w:noProof/>
-          <w:spacing w:val="0"/>
-          <w:kern w:val="0"/>
           <w:sz w:val="24"/>
           <w:szCs w:val="24"/>
         </w:rPr>
@@ -283,7 +283,7 @@
           <w:r>
             <w:fldChar w:fldCharType="separate"/>
           </w:r>
-          <w:hyperlink w:anchor="_Toc242210075" w:history="1">
+          <w:hyperlink w:anchor="_Toc242256061" w:history="1">
             <w:r>
               <w:rPr>
                 <w:rStyle w:val="Hyperlink"/>
@@ -390,7 +390,7 @@
                 <w:noProof/>
                 <w:webHidden/>
               </w:rPr>
-              <w:instrText xml:space="preserve"> PAGEREF _Toc242210075 \h </w:instrText>
+              <w:instrText xml:space="preserve"> PAGEREF _Toc242256061 \h </w:instrText>
             </w:r>
             <w:r>
               <w:rPr>
@@ -440,7 +440,7 @@
               <w14:ligatures w14:val="standardContextual"/>
             </w:rPr>
           </w:pPr>
-          <w:hyperlink w:anchor="_Toc242210076" w:history="1">
+          <w:hyperlink w:anchor="_Toc242256062" w:history="1">
             <w:r>
               <w:rPr>
                 <w:rStyle w:val="Hyperlink"/>
@@ -588,7 +588,7 @@
                 <w:noProof/>
                 <w:webHidden/>
               </w:rPr>
-              <w:instrText xml:space="preserve"> PAGEREF _Toc242210076 \h </w:instrText>
+              <w:instrText xml:space="preserve"> PAGEREF _Toc242256062 \h </w:instrText>
             </w:r>
             <w:r>
               <w:rPr>
@@ -638,7 +638,7 @@
               <w14:ligatures w14:val="standardContextual"/>
             </w:rPr>
           </w:pPr>
-          <w:hyperlink w:anchor="_Toc242210077" w:history="1">
+          <w:hyperlink w:anchor="_Toc242256063" w:history="1">
             <w:r>
               <w:rPr>
                 <w:rStyle w:val="Hyperlink"/>
@@ -793,7 +793,7 @@
                 <w:noProof/>
                 <w:webHidden/>
               </w:rPr>
-              <w:instrText xml:space="preserve"> PAGEREF _Toc242210077 \h </w:instrText>
+              <w:instrText xml:space="preserve"> PAGEREF _Toc242256063 \h </w:instrText>
             </w:r>
             <w:r>
               <w:rPr>
@@ -843,7 +843,7 @@
               <w14:ligatures w14:val="standardContextual"/>
             </w:rPr>
           </w:pPr>
-          <w:hyperlink w:anchor="_Toc242210078" w:history="1">
+          <w:hyperlink w:anchor="_Toc242256064" w:history="1">
             <w:r>
               <w:rPr>
                 <w:rStyle w:val="Hyperlink"/>
@@ -940,7 +940,7 @@
                 <w:noProof/>
                 <w:webHidden/>
               </w:rPr>
-              <w:instrText xml:space="preserve"> PAGEREF _Toc242210078 \h </w:instrText>
+              <w:instrText xml:space="preserve"> PAGEREF _Toc242256064 \h </w:instrText>
             </w:r>
             <w:r>
               <w:rPr>
@@ -990,7 +990,7 @@
               <w14:ligatures w14:val="standardContextual"/>
             </w:rPr>
           </w:pPr>
-          <w:hyperlink w:anchor="_Toc242210079" w:history="1">
+          <w:hyperlink w:anchor="_Toc242256065" w:history="1">
             <w:r>
               <w:rPr>
                 <w:rStyle w:val="Hyperlink"/>
@@ -1069,28 +1069,6 @@
             </w:r>
             <w:r>
               <w:rPr>
-                <w:rStyle w:val="Hyperlink"/>
-                <w:noProof/>
-              </w:rPr>
-              <w:t xml:space="preserve"> (</w:t>
-            </w:r>
-            <w:r>
-              <w:rPr>
-                <w:rStyle w:val="Hyperlink"/>
-                <w:rFonts w:ascii="Liberation Mono" w:hAnsi="Liberation Mono"/>
-                <w:noProof/>
-              </w:rPr>
-              <w:t>/admin/:tenantId/quotes</w:t>
-            </w:r>
-            <w:r>
-              <w:rPr>
-                <w:rStyle w:val="Hyperlink"/>
-                <w:noProof/>
-              </w:rPr>
-              <w:t>)</w:t>
-            </w:r>
-            <w:r>
-              <w:rPr>
                 <w:noProof/>
                 <w:webHidden/>
               </w:rPr>
@@ -1109,7 +1087,7 @@
                 <w:noProof/>
                 <w:webHidden/>
               </w:rPr>
-              <w:instrText xml:space="preserve"> PAGEREF _Toc242210079 \h </w:instrText>
+              <w:instrText xml:space="preserve"> PAGEREF _Toc242256065 \h </w:instrText>
             </w:r>
             <w:r>
               <w:rPr>
@@ -1159,7 +1137,7 @@
               <w14:ligatures w14:val="standardContextual"/>
             </w:rPr>
           </w:pPr>
-          <w:hyperlink w:anchor="_Toc242210080" w:history="1">
+          <w:hyperlink w:anchor="_Toc242256066" w:history="1">
             <w:r>
               <w:rPr>
                 <w:rStyle w:val="Hyperlink"/>
@@ -1221,28 +1199,6 @@
             </w:r>
             <w:r>
               <w:rPr>
-                <w:rStyle w:val="Hyperlink"/>
-                <w:noProof/>
-              </w:rPr>
-              <w:t xml:space="preserve"> (</w:t>
-            </w:r>
-            <w:r>
-              <w:rPr>
-                <w:rStyle w:val="Hyperlink"/>
-                <w:rFonts w:ascii="Liberation Mono" w:hAnsi="Liberation Mono"/>
-                <w:noProof/>
-              </w:rPr>
-              <w:t>/quote/:rfqId</w:t>
-            </w:r>
-            <w:r>
-              <w:rPr>
-                <w:rStyle w:val="Hyperlink"/>
-                <w:noProof/>
-              </w:rPr>
-              <w:t>)</w:t>
-            </w:r>
-            <w:r>
-              <w:rPr>
                 <w:noProof/>
                 <w:webHidden/>
               </w:rPr>
@@ -1261,7 +1217,7 @@
                 <w:noProof/>
                 <w:webHidden/>
               </w:rPr>
-              <w:instrText xml:space="preserve"> PAGEREF _Toc242210080 \h </w:instrText>
+              <w:instrText xml:space="preserve"> PAGEREF _Toc242256066 \h </w:instrText>
             </w:r>
             <w:r>
               <w:rPr>
@@ -1311,7 +1267,7 @@
               <w14:ligatures w14:val="standardContextual"/>
             </w:rPr>
           </w:pPr>
-          <w:hyperlink w:anchor="_Toc242210081" w:history="1">
+          <w:hyperlink w:anchor="_Toc242256067" w:history="1">
             <w:r>
               <w:rPr>
                 <w:rStyle w:val="Hyperlink"/>
@@ -1442,7 +1398,7 @@
                 <w:noProof/>
                 <w:webHidden/>
               </w:rPr>
-              <w:instrText xml:space="preserve"> PAGEREF _Toc242210081 \h </w:instrText>
+              <w:instrText xml:space="preserve"> PAGEREF _Toc242256067 \h </w:instrText>
             </w:r>
             <w:r>
               <w:rPr>
@@ -1492,7 +1448,7 @@
               <w14:ligatures w14:val="standardContextual"/>
             </w:rPr>
           </w:pPr>
-          <w:hyperlink w:anchor="_Toc242210082" w:history="1">
+          <w:hyperlink w:anchor="_Toc242256068" w:history="1">
             <w:r>
               <w:rPr>
                 <w:rStyle w:val="Hyperlink"/>
@@ -1623,7 +1579,7 @@
                 <w:noProof/>
                 <w:webHidden/>
               </w:rPr>
-              <w:instrText xml:space="preserve"> PAGEREF _Toc242210082 \h </w:instrText>
+              <w:instrText xml:space="preserve"> PAGEREF _Toc242256068 \h </w:instrText>
             </w:r>
             <w:r>
               <w:rPr>
@@ -1673,7 +1629,7 @@
               <w14:ligatures w14:val="standardContextual"/>
             </w:rPr>
           </w:pPr>
-          <w:hyperlink w:anchor="_Toc242210083" w:history="1">
+          <w:hyperlink w:anchor="_Toc242256069" w:history="1">
             <w:r>
               <w:rPr>
                 <w:rStyle w:val="Hyperlink"/>
@@ -1804,7 +1760,7 @@
                 <w:noProof/>
                 <w:webHidden/>
               </w:rPr>
-              <w:instrText xml:space="preserve"> PAGEREF _Toc242210083 \h </w:instrText>
+              <w:instrText xml:space="preserve"> PAGEREF _Toc242256069 \h </w:instrText>
             </w:r>
             <w:r>
               <w:rPr>
@@ -1854,7 +1810,7 @@
               <w14:ligatures w14:val="standardContextual"/>
             </w:rPr>
           </w:pPr>
-          <w:hyperlink w:anchor="_Toc242210084" w:history="1">
+          <w:hyperlink w:anchor="_Toc242256070" w:history="1">
             <w:r>
               <w:rPr>
                 <w:rStyle w:val="Hyperlink"/>
@@ -2002,7 +1958,7 @@
                 <w:noProof/>
                 <w:webHidden/>
               </w:rPr>
-              <w:instrText xml:space="preserve"> PAGEREF _Toc242210084 \h </w:instrText>
+              <w:instrText xml:space="preserve"> PAGEREF _Toc242256070 \h </w:instrText>
             </w:r>
             <w:r>
               <w:rPr>
@@ -2052,7 +2008,7 @@
               <w14:ligatures w14:val="standardContextual"/>
             </w:rPr>
           </w:pPr>
-          <w:hyperlink w:anchor="_Toc242210085" w:history="1">
+          <w:hyperlink w:anchor="_Toc242256071" w:history="1">
             <w:r>
               <w:rPr>
                 <w:rStyle w:val="Hyperlink"/>
@@ -2149,7 +2105,7 @@
                 <w:noProof/>
                 <w:webHidden/>
               </w:rPr>
-              <w:instrText xml:space="preserve"> PAGEREF _Toc242210085 \h </w:instrText>
+              <w:instrText xml:space="preserve"> PAGEREF _Toc242256071 \h </w:instrText>
             </w:r>
             <w:r>
               <w:rPr>
@@ -2199,7 +2155,7 @@
               <w14:ligatures w14:val="standardContextual"/>
             </w:rPr>
           </w:pPr>
-          <w:hyperlink w:anchor="_Toc242210086" w:history="1">
+          <w:hyperlink w:anchor="_Toc242256072" w:history="1">
             <w:r>
               <w:rPr>
                 <w:rStyle w:val="Hyperlink"/>
@@ -2387,7 +2343,7 @@
                 <w:noProof/>
                 <w:webHidden/>
               </w:rPr>
-              <w:instrText xml:space="preserve"> PAGEREF _Toc242210086 \h </w:instrText>
+              <w:instrText xml:space="preserve"> PAGEREF _Toc242256072 \h </w:instrText>
             </w:r>
             <w:r>
               <w:rPr>
@@ -2437,7 +2393,7 @@
               <w14:ligatures w14:val="standardContextual"/>
             </w:rPr>
           </w:pPr>
-          <w:hyperlink w:anchor="_Toc242210087" w:history="1">
+          <w:hyperlink w:anchor="_Toc242256073" w:history="1">
             <w:r>
               <w:rPr>
                 <w:rStyle w:val="Hyperlink"/>
@@ -2517,7 +2473,7 @@
                 <w:noProof/>
                 <w:webHidden/>
               </w:rPr>
-              <w:instrText xml:space="preserve"> PAGEREF _Toc242210087 \h </w:instrText>
+              <w:instrText xml:space="preserve"> PAGEREF _Toc242256073 \h </w:instrText>
             </w:r>
             <w:r>
               <w:rPr>
@@ -2567,7 +2523,7 @@
               <w14:ligatures w14:val="standardContextual"/>
             </w:rPr>
           </w:pPr>
-          <w:hyperlink w:anchor="_Toc242210088" w:history="1">
+          <w:hyperlink w:anchor="_Toc242256074" w:history="1">
             <w:r>
               <w:rPr>
                 <w:rStyle w:val="Hyperlink"/>
@@ -2697,38 +2653,6 @@
             </w:r>
             <w:r>
               <w:rPr>
-                <w:rStyle w:val="Hyperlink"/>
-                <w:noProof/>
-              </w:rPr>
-              <w:t xml:space="preserve"> )</w:t>
-            </w:r>
-            <w:r>
-              <w:rPr>
-                <w:rStyle w:val="Hyperlink"/>
-                <w:rFonts w:ascii="Arial" w:hAnsi="Arial" w:cs="Arial"/>
-                <w:noProof/>
-                <w:rtl/>
-              </w:rPr>
-              <w:t xml:space="preserve">שליטת </w:t>
-            </w:r>
-            <w:r>
-              <w:rPr>
-                <w:rStyle w:val="Hyperlink"/>
-                <w:noProof/>
-              </w:rPr>
-              <w:t xml:space="preserve"> SuperAdmin</w:t>
-            </w:r>
-            <w:r>
-              <w:rPr>
-                <w:rStyle w:val="Hyperlink"/>
-                <w:rFonts w:cs="Times New Roman"/>
-                <w:noProof/>
-                <w:rtl/>
-              </w:rPr>
-              <w:t>)</w:t>
-            </w:r>
-            <w:r>
-              <w:rPr>
                 <w:noProof/>
                 <w:webHidden/>
               </w:rPr>
@@ -2747,7 +2671,7 @@
                 <w:noProof/>
                 <w:webHidden/>
               </w:rPr>
-              <w:instrText xml:space="preserve"> PAGEREF _Toc242210088 \h </w:instrText>
+              <w:instrText xml:space="preserve"> PAGEREF _Toc242256074 \h </w:instrText>
             </w:r>
             <w:r>
               <w:rPr>
@@ -2797,7 +2721,7 @@
               <w14:ligatures w14:val="standardContextual"/>
             </w:rPr>
           </w:pPr>
-          <w:hyperlink w:anchor="_Toc242210089" w:history="1">
+          <w:hyperlink w:anchor="_Toc242256075" w:history="1">
             <w:r>
               <w:rPr>
                 <w:rStyle w:val="Hyperlink"/>
@@ -2928,7 +2852,7 @@
                 <w:noProof/>
                 <w:webHidden/>
               </w:rPr>
-              <w:instrText xml:space="preserve"> PAGEREF _Toc242210089 \h </w:instrText>
+              <w:instrText xml:space="preserve"> PAGEREF _Toc242256075 \h </w:instrText>
             </w:r>
             <w:r>
               <w:rPr>
@@ -2978,7 +2902,7 @@
               <w14:ligatures w14:val="standardContextual"/>
             </w:rPr>
           </w:pPr>
-          <w:hyperlink w:anchor="_Toc242210090" w:history="1">
+          <w:hyperlink w:anchor="_Toc242256076" w:history="1">
             <w:r>
               <w:rPr>
                 <w:rStyle w:val="Hyperlink"/>
@@ -3099,7 +3023,7 @@
                 <w:noProof/>
                 <w:webHidden/>
               </w:rPr>
-              <w:instrText xml:space="preserve"> PAGEREF _Toc242210090 \h </w:instrText>
+              <w:instrText xml:space="preserve"> PAGEREF _Toc242256076 \h </w:instrText>
             </w:r>
             <w:r>
               <w:rPr>
@@ -3149,7 +3073,7 @@
               <w14:ligatures w14:val="standardContextual"/>
             </w:rPr>
           </w:pPr>
-          <w:hyperlink w:anchor="_Toc242210091" w:history="1">
+          <w:hyperlink w:anchor="_Toc242256077" w:history="1">
             <w:r>
               <w:rPr>
                 <w:rStyle w:val="Hyperlink"/>
@@ -3288,7 +3212,7 @@
                 <w:noProof/>
                 <w:webHidden/>
               </w:rPr>
-              <w:instrText xml:space="preserve"> PAGEREF _Toc242210091 \h </w:instrText>
+              <w:instrText xml:space="preserve"> PAGEREF _Toc242256077 \h </w:instrText>
             </w:r>
             <w:r>
               <w:rPr>
@@ -3338,7 +3262,7 @@
               <w14:ligatures w14:val="standardContextual"/>
             </w:rPr>
           </w:pPr>
-          <w:hyperlink w:anchor="_Toc242210092" w:history="1">
+          <w:hyperlink w:anchor="_Toc242256078" w:history="1">
             <w:r>
               <w:rPr>
                 <w:rStyle w:val="Hyperlink"/>
@@ -3451,7 +3375,7 @@
                 <w:noProof/>
                 <w:webHidden/>
               </w:rPr>
-              <w:instrText xml:space="preserve"> PAGEREF _Toc242210092 \h </w:instrText>
+              <w:instrText xml:space="preserve"> PAGEREF _Toc242256078 \h </w:instrText>
             </w:r>
             <w:r>
               <w:rPr>
@@ -3524,7 +3448,7 @@
         <w:pStyle w:val="Heading1"/>
         <w:bidi/>
       </w:pPr>
-      <w:bookmarkStart w:id="0" w:name="_Toc242210075"/>
+      <w:bookmarkStart w:id="0" w:name="_Toc242256061"/>
       <w:r>
         <w:rPr>
           <w:rFonts w:cs="Times New Roman" w:hint="cs"/>
@@ -3600,7 +3524,7 @@
         <w:pStyle w:val="Heading2"/>
         <w:bidi/>
       </w:pPr>
-      <w:bookmarkStart w:id="1" w:name="_Toc242210076"/>
+      <w:bookmarkStart w:id="1" w:name="_Toc242256062"/>
       <w:r>
         <w:rPr>
           <w:rFonts w:cs="Times New Roman" w:hint="cs"/>
@@ -3885,7 +3809,21 @@
         <w:rPr>
           <w:b/>
         </w:rPr>
-        <w:t xml:space="preserve"> (CapEx) </w:t>
+        <w:t xml:space="preserve"> (</w:t>
+      </w:r>
+      <w:proofErr w:type="spellStart"/>
+      <w:r>
+        <w:rPr>
+          <w:b/>
+        </w:rPr>
+        <w:t>CapEx</w:t>
+      </w:r>
+      <w:proofErr w:type="spellEnd"/>
+      <w:r>
+        <w:rPr>
+          <w:b/>
+        </w:rPr>
+        <w:t xml:space="preserve">) </w:t>
       </w:r>
       <w:r>
         <w:rPr>
@@ -3984,7 +3922,7 @@
           <w:noProof/>
         </w:rPr>
         <w:drawing>
-          <wp:inline distT="0" distB="0" distL="0" distR="0" wp14:anchorId="12C7433F" wp14:editId="3795582D">
+          <wp:inline distT="0" distB="0" distL="0" distR="0" wp14:anchorId="12C7433F" wp14:editId="5D061DB3">
             <wp:extent cx="6120130" cy="4114800"/>
             <wp:effectExtent l="0" t="0" r="0" b="0"/>
             <wp:docPr id="502268409" name="Picture 1"/>
@@ -4037,7 +3975,7 @@
         <w:pStyle w:val="Heading2"/>
         <w:bidi/>
       </w:pPr>
-      <w:bookmarkStart w:id="2" w:name="_Toc242210077"/>
+      <w:bookmarkStart w:id="2" w:name="_Toc242256063"/>
       <w:r>
         <w:rPr>
           <w:rFonts w:cs="Times New Roman" w:hint="cs"/>
@@ -4621,7 +4559,7 @@
         <w:pStyle w:val="Heading1"/>
         <w:bidi/>
       </w:pPr>
-      <w:bookmarkStart w:id="3" w:name="_Toc242210078"/>
+      <w:bookmarkStart w:id="3" w:name="_Toc242256064"/>
       <w:r>
         <w:rPr>
           <w:rFonts w:cs="Times New Roman" w:hint="cs"/>
@@ -4769,7 +4707,7 @@
         <w:pStyle w:val="Heading2"/>
         <w:bidi/>
       </w:pPr>
-      <w:bookmarkStart w:id="4" w:name="_Toc242210079"/>
+      <w:bookmarkStart w:id="4" w:name="_Toc242256065"/>
       <w:r>
         <w:rPr>
           <w:rFonts w:cs="Times New Roman" w:hint="cs"/>
@@ -4827,10 +4765,10 @@
         </w:rPr>
         <w:t>בבניין</w:t>
       </w:r>
-      <w:r>
-        <w:t xml:space="preserve"> </w:t>
-      </w:r>
       <w:bookmarkEnd w:id="4"/>
+      <w:r>
+        <w:t xml:space="preserve"> </w:t>
+      </w:r>
     </w:p>
     <w:p>
       <w:pPr>
@@ -5241,7 +5179,7 @@
         <w:pStyle w:val="Heading2"/>
         <w:bidi/>
       </w:pPr>
-      <w:bookmarkStart w:id="5" w:name="_Toc242210080"/>
+      <w:bookmarkStart w:id="5" w:name="_Toc242256066"/>
       <w:r>
         <w:rPr>
           <w:rFonts w:cs="Times New Roman" w:hint="cs"/>
@@ -5287,10 +5225,10 @@
         </w:rPr>
         <w:t>הייעודי</w:t>
       </w:r>
-      <w:r>
-        <w:t xml:space="preserve"> </w:t>
-      </w:r>
       <w:bookmarkEnd w:id="5"/>
+      <w:r>
+        <w:t xml:space="preserve"> </w:t>
+      </w:r>
     </w:p>
     <w:p>
       <w:pPr>
@@ -5598,7 +5536,7 @@
         <w:pStyle w:val="Heading2"/>
         <w:bidi/>
       </w:pPr>
-      <w:bookmarkStart w:id="6" w:name="_Toc242210081"/>
+      <w:bookmarkStart w:id="6" w:name="_Toc242256067"/>
       <w:r>
         <w:rPr>
           <w:rFonts w:cs="Times New Roman" w:hint="cs"/>
@@ -5969,7 +5907,7 @@
         <w:pStyle w:val="Heading2"/>
         <w:bidi/>
       </w:pPr>
-      <w:bookmarkStart w:id="7" w:name="_Toc242210082"/>
+      <w:bookmarkStart w:id="7" w:name="_Toc242256068"/>
       <w:r>
         <w:rPr>
           <w:rFonts w:cs="Times New Roman" w:hint="cs"/>
@@ -6179,7 +6117,7 @@
         <w:pStyle w:val="Heading2"/>
         <w:bidi/>
       </w:pPr>
-      <w:bookmarkStart w:id="8" w:name="_Toc242210083"/>
+      <w:bookmarkStart w:id="8" w:name="_Toc242256069"/>
       <w:r>
         <w:rPr>
           <w:rFonts w:cs="Times New Roman" w:hint="cs"/>
@@ -6530,7 +6468,7 @@
         <w:pStyle w:val="Heading1"/>
         <w:bidi/>
       </w:pPr>
-      <w:bookmarkStart w:id="9" w:name="_Toc242210084"/>
+      <w:bookmarkStart w:id="9" w:name="_Toc242256070"/>
       <w:r>
         <w:rPr>
           <w:rFonts w:cs="Times New Roman" w:hint="cs"/>
@@ -6634,7 +6572,7 @@
         <w:pStyle w:val="Heading2"/>
         <w:bidi/>
       </w:pPr>
-      <w:bookmarkStart w:id="10" w:name="_Toc242210085"/>
+      <w:bookmarkStart w:id="10" w:name="_Toc242256071"/>
       <w:r>
         <w:rPr>
           <w:rFonts w:cs="Times New Roman" w:hint="cs"/>
@@ -6849,7 +6787,7 @@
         <w:pStyle w:val="Heading2"/>
         <w:bidi/>
       </w:pPr>
-      <w:bookmarkStart w:id="11" w:name="_Toc242210086"/>
+      <w:bookmarkStart w:id="11" w:name="_Toc242256072"/>
       <w:r>
         <w:rPr>
           <w:rFonts w:cs="Times New Roman" w:hint="cs"/>
@@ -7006,6 +6944,7 @@
         </w:rPr>
         <w:t>-</w:t>
       </w:r>
+      <w:proofErr w:type="gramStart"/>
       <w:r>
         <w:t>RFQ</w:t>
       </w:r>
@@ -7024,7 +6963,14 @@
         <w:rPr>
           <w:rtl/>
         </w:rPr>
-        <w:t>כ-</w:t>
+        <w:t>כ</w:t>
+      </w:r>
+      <w:proofErr w:type="gramEnd"/>
+      <w:r>
+        <w:rPr>
+          <w:rtl/>
+        </w:rPr>
+        <w:t>-</w:t>
       </w:r>
       <w:r>
         <w:rPr>
@@ -7112,7 +7058,7 @@
               <w:jc w:val="left"/>
               <w:rPr>
                 <w:rStyle w:val="Strong"/>
-                <w:rFonts w:ascii="Arial" w:hAnsi="Arial" w:cs="Arial" w:hint="cs"/>
+                <w:rFonts w:ascii="Arial" w:hAnsi="Arial" w:cs="Arial"/>
                 <w:rtl/>
               </w:rPr>
             </w:pPr>
@@ -7145,7 +7091,7 @@
               <w:jc w:val="left"/>
               <w:rPr>
                 <w:rStyle w:val="Strong"/>
-                <w:rFonts w:ascii="Arial" w:hAnsi="Arial" w:cs="Arial" w:hint="cs"/>
+                <w:rFonts w:ascii="Arial" w:hAnsi="Arial" w:cs="Arial"/>
                 <w:rtl/>
               </w:rPr>
             </w:pPr>
@@ -7171,7 +7117,7 @@
               <w:jc w:val="left"/>
               <w:rPr>
                 <w:rStyle w:val="Strong"/>
-                <w:rFonts w:ascii="Arial" w:hAnsi="Arial" w:cs="Arial" w:hint="cs"/>
+                <w:rFonts w:ascii="Arial" w:hAnsi="Arial" w:cs="Arial"/>
                 <w:rtl/>
               </w:rPr>
             </w:pPr>
@@ -7635,7 +7581,6 @@
               <w:pStyle w:val="TableContents"/>
               <w:bidi/>
               <w:rPr>
-                <w:rFonts w:hint="cs"/>
                 <w:lang w:bidi="he-IL"/>
               </w:rPr>
             </w:pPr>
@@ -7970,7 +7915,7 @@
         <w:pStyle w:val="Heading2"/>
         <w:bidi/>
       </w:pPr>
-      <w:bookmarkStart w:id="12" w:name="_Toc242210087"/>
+      <w:bookmarkStart w:id="12" w:name="_Toc242256073"/>
       <w:r>
         <w:rPr>
           <w:rFonts w:cs="Times New Roman" w:hint="cs"/>
@@ -8178,7 +8123,7 @@
         <w:pStyle w:val="Heading2"/>
         <w:bidi/>
       </w:pPr>
-      <w:bookmarkStart w:id="13" w:name="_Toc242210088"/>
+      <w:bookmarkStart w:id="13" w:name="_Toc242256074"/>
       <w:r>
         <w:rPr>
           <w:rFonts w:cs="Times New Roman" w:hint="cs"/>
@@ -8298,7 +8243,15 @@
         <w:t>ה</w:t>
       </w:r>
       <w:r>
-        <w:t xml:space="preserve">-SuperAdmin </w:t>
+        <w:t>-</w:t>
+      </w:r>
+      <w:proofErr w:type="spellStart"/>
+      <w:r>
+        <w:t>SuperAdmin</w:t>
+      </w:r>
+      <w:proofErr w:type="spellEnd"/>
+      <w:r>
+        <w:t xml:space="preserve"> </w:t>
       </w:r>
       <w:r>
         <w:rPr>
@@ -8315,12 +8268,13 @@
         <w:pStyle w:val="BodyText"/>
         <w:bidi/>
         <w:rPr>
-          <w:rFonts w:cs="Times New Roman" w:hint="cs"/>
-        </w:rPr>
-      </w:pPr>
-      <w:r>
-        <w:rPr>
           <w:rFonts w:cs="Times New Roman"/>
+        </w:rPr>
+      </w:pPr>
+      <w:r>
+        <w:rPr>
+          <w:rFonts w:cs="Times New Roman"/>
+          <w:noProof/>
           <w:rtl/>
           <w:lang w:bidi="he-IL"/>
         </w:rPr>
@@ -8674,7 +8628,7 @@
         <w:pStyle w:val="Heading2"/>
         <w:bidi/>
       </w:pPr>
-      <w:bookmarkStart w:id="14" w:name="_Toc242210089"/>
+      <w:bookmarkStart w:id="14" w:name="_Toc242256075"/>
       <w:r>
         <w:rPr>
           <w:rFonts w:cs="Times New Roman" w:hint="cs"/>
@@ -9013,7 +8967,7 @@
         <w:pStyle w:val="Heading1"/>
         <w:bidi/>
       </w:pPr>
-      <w:bookmarkStart w:id="15" w:name="_Toc242210090"/>
+      <w:bookmarkStart w:id="15" w:name="_Toc242256076"/>
       <w:r>
         <w:rPr>
           <w:rFonts w:cs="Times New Roman" w:hint="cs"/>
@@ -9587,7 +9541,7 @@
         <w:pStyle w:val="Heading1"/>
         <w:bidi/>
       </w:pPr>
-      <w:bookmarkStart w:id="16" w:name="_Toc242210091"/>
+      <w:bookmarkStart w:id="16" w:name="_Toc242256077"/>
       <w:r>
         <w:rPr>
           <w:rFonts w:cs="Times New Roman" w:hint="cs"/>
@@ -10114,7 +10068,7 @@
         <w:pStyle w:val="Heading1"/>
         <w:bidi/>
       </w:pPr>
-      <w:bookmarkStart w:id="17" w:name="_Toc242210092"/>
+      <w:bookmarkStart w:id="17" w:name="_Toc242256078"/>
       <w:r>
         <w:rPr>
           <w:rFonts w:cs="Times New Roman" w:hint="cs"/>
@@ -10422,7 +10376,7 @@
         <w:pStyle w:val="BodyText"/>
         <w:bidi/>
         <w:rPr>
-          <w:rFonts w:cs="Times New Roman" w:hint="cs"/>
+          <w:rFonts w:cs="Times New Roman"/>
         </w:rPr>
       </w:pPr>
     </w:p>

</xml_diff>